<commit_message>
fix: update CORS middleware to support Vercel and local origins
</commit_message>
<xml_diff>
--- a/Atithi_VMS_Final_Project_Report.docx
+++ b/Atithi_VMS_Final_Project_Report.docx
@@ -189,6 +189,63 @@
                 <w:szCs w:val="21"/>
               </w:rPr>
               <w:t>https://github.com/AbhiralJain07/visitor-management-system.git</w:t>
+            </w:r>
+          </w:p>
+        </w:tc>
+      </w:tr>
+      <w:tr>
+        <w:tblPrEx>
+          <w:tblCellMar>
+            <w:top w:w="0" w:type="dxa"/>
+            <w:bottom w:w="0" w:type="dxa"/>
+          </w:tblCellMar>
+        </w:tblPrEx>
+        <w:trPr>
+          <w:jc w:val="center"/>
+        </w:trPr>
+        <w:tc>
+          <w:tcPr>
+            <w:tcW w:w="2500" w:type="dxa"/>
+          </w:tcPr>
+          <w:p>
+            <w:pPr>
+              <w:rPr>
+                <w:b/>
+                <w:bCs/>
+                <w:color w:val="595959"/>
+                <w:sz w:val="21"/>
+                <w:szCs w:val="21"/>
+              </w:rPr>
+            </w:pPr>
+            <w:r>
+              <w:rPr>
+                <w:b/>
+                <w:bCs/>
+                <w:color w:val="595959"/>
+                <w:sz w:val="21"/>
+                <w:szCs w:val="21"/>
+              </w:rPr>
+              <w:t>Project Link</w:t>
+            </w:r>
+          </w:p>
+        </w:tc>
+        <w:tc>
+          <w:tcPr>
+            <w:tcW w:w="4500" w:type="dxa"/>
+          </w:tcPr>
+          <w:p>
+            <w:pPr>
+              <w:rPr>
+                <w:sz w:val="21"/>
+                <w:szCs w:val="21"/>
+              </w:rPr>
+            </w:pPr>
+            <w:r>
+              <w:rPr>
+                <w:sz w:val="21"/>
+                <w:szCs w:val="21"/>
+              </w:rPr>
+              <w:t>https://visitor-management-system-bxwbc0wsd-abhiraljain07s-projects.vercel.app/login</w:t>
             </w:r>
           </w:p>
         </w:tc>

</xml_diff>